<commit_message>
Mise à jour du rapport final
</commit_message>
<xml_diff>
--- a/Rapport_Final_Mexora_KADI_Mekkaoui.docx
+++ b/Rapport_Final_Mexora_KADI_Mekkaoui.docx
@@ -1054,27 +1054,103 @@
       <w:pPr>
         <w:jc w:val="center"/>
         <w:rPr>
-          <w:lang w:val="en-US"/>
-        </w:rPr>
-      </w:pPr>
-      <w:proofErr w:type="gramStart"/>
-      <w:r>
-        <w:rPr>
           <w:color w:val="2C5F8A"/>
           <w:lang w:val="en-US"/>
         </w:rPr>
-        <w:t>GitHub :</w:t>
-      </w:r>
-      <w:proofErr w:type="gramEnd"/>
+      </w:pPr>
+      <w:proofErr w:type="gramStart"/>
       <w:r>
         <w:rPr>
           <w:color w:val="2C5F8A"/>
           <w:lang w:val="en-US"/>
         </w:rPr>
-        <w:t xml:space="preserve"> https://github.com/kadiikram/mexora_etl</w:t>
-      </w:r>
-      <w:bookmarkStart w:id="0" w:name="_GoBack"/>
-      <w:bookmarkEnd w:id="0"/>
+        <w:t>GitHub :</w:t>
+      </w:r>
+      <w:proofErr w:type="gramEnd"/>
+      <w:r>
+        <w:rPr>
+          <w:color w:val="2C5F8A"/>
+          <w:lang w:val="en-US"/>
+        </w:rPr>
+        <w:t xml:space="preserve"> </w:t>
+      </w:r>
+      <w:r>
+        <w:fldChar w:fldCharType="begin"/>
+      </w:r>
+      <w:r>
+        <w:rPr>
+          <w:lang w:val="en-US"/>
+        </w:rPr>
+        <w:instrText xml:space="preserve"> HYPERLINK "https://github.com/kadiikram/mexora_etl" </w:instrText>
+      </w:r>
+      <w:r>
+        <w:fldChar w:fldCharType="separate"/>
+      </w:r>
+      <w:r>
+        <w:rPr>
+          <w:rStyle w:val="Lienhypertexte"/>
+          <w:lang w:val="en-US"/>
+        </w:rPr>
+        <w:t>https://github.com/kadiikram/mexora_etl</w:t>
+      </w:r>
+      <w:r>
+        <w:rPr>
+          <w:rStyle w:val="Lienhypertexte"/>
+          <w:lang w:val="en-US"/>
+        </w:rPr>
+        <w:fldChar w:fldCharType="end"/>
+      </w:r>
+    </w:p>
+    <w:p>
+      <w:pPr>
+        <w:jc w:val="center"/>
+        <w:rPr>
+          <w:color w:val="2C5F8A"/>
+          <w:lang w:val="en-US"/>
+        </w:rPr>
+      </w:pPr>
+      <w:proofErr w:type="gramStart"/>
+      <w:r>
+        <w:rPr>
+          <w:color w:val="2C5F8A"/>
+          <w:lang w:val="en-US"/>
+        </w:rPr>
+        <w:t>GitHub :</w:t>
+      </w:r>
+      <w:proofErr w:type="gramEnd"/>
+      <w:r>
+        <w:rPr>
+          <w:color w:val="2C5F8A"/>
+          <w:lang w:val="en-US"/>
+        </w:rPr>
+        <w:t xml:space="preserve"> </w:t>
+      </w:r>
+      <w:hyperlink r:id="rId9" w:history="1">
+        <w:r>
+          <w:rPr>
+            <w:rStyle w:val="Lienhypertexte"/>
+            <w:lang w:val="en-US"/>
+          </w:rPr>
+          <w:t>https://github.com/mekkaouiloubna/mexora_etl</w:t>
+        </w:r>
+      </w:hyperlink>
+    </w:p>
+    <w:p>
+      <w:pPr>
+        <w:jc w:val="center"/>
+        <w:rPr>
+          <w:color w:val="2C5F8A"/>
+          <w:lang w:val="en-US"/>
+        </w:rPr>
+      </w:pPr>
+    </w:p>
+    <w:p>
+      <w:pPr>
+        <w:jc w:val="center"/>
+        <w:rPr>
+          <w:lang w:val="en-US"/>
+        </w:rPr>
+      </w:pPr>
     </w:p>
     <w:p>
       <w:pPr>
@@ -1096,69 +1172,15 @@
         <w:t xml:space="preserve"> Universitaire : 2025-2026  </w:t>
       </w:r>
     </w:p>
-    <w:p>
-      <w:pPr>
-        <w:rPr>
-          <w:lang w:val="en-US"/>
-        </w:rPr>
-      </w:pPr>
-    </w:p>
-    <w:p>
-      <w:pPr>
-        <w:rPr>
-          <w:lang w:val="en-US"/>
-        </w:rPr>
-      </w:pPr>
-    </w:p>
-    <w:p>
-      <w:pPr>
-        <w:rPr>
-          <w:lang w:val="en-US"/>
-        </w:rPr>
-      </w:pPr>
-    </w:p>
-    <w:p>
-      <w:pPr>
-        <w:rPr>
-          <w:lang w:val="en-US"/>
-        </w:rPr>
-      </w:pPr>
-    </w:p>
-    <w:p>
-      <w:pPr>
-        <w:rPr>
-          <w:lang w:val="en-US"/>
-        </w:rPr>
-      </w:pPr>
-    </w:p>
-    <w:p>
-      <w:pPr>
-        <w:rPr>
-          <w:lang w:val="en-US"/>
-        </w:rPr>
-      </w:pPr>
-    </w:p>
-    <w:p>
-      <w:pPr>
-        <w:rPr>
-          <w:lang w:val="en-US"/>
-        </w:rPr>
-      </w:pPr>
-    </w:p>
-    <w:p>
-      <w:pPr>
-        <w:rPr>
-          <w:lang w:val="en-US"/>
-        </w:rPr>
-      </w:pPr>
-    </w:p>
-    <w:p>
-      <w:pPr>
-        <w:rPr>
-          <w:lang w:val="en-US"/>
-        </w:rPr>
-      </w:pPr>
-    </w:p>
+    <w:p/>
+    <w:p/>
+    <w:p/>
+    <w:p/>
+    <w:p/>
+    <w:p/>
+    <w:p/>
+    <w:p/>
+    <w:p/>
     <w:p>
       <w:pPr>
         <w:pStyle w:val="Titre1"/>
@@ -2807,11 +2829,81 @@
         <w:jc w:val="both"/>
       </w:pPr>
       <w:r>
-        <w:t>L'ensemble du code source est disponible sur GitHub : https://github.com/kadiikram/mexora_etl</w:t>
-      </w:r>
-    </w:p>
-    <w:p>
-      <w:r>
+        <w:t xml:space="preserve">L'ensemble du code source est disponible sur GitHub : </w:t>
+      </w:r>
+      <w:hyperlink r:id="rId10" w:history="1">
+        <w:r>
+          <w:rPr>
+            <w:rStyle w:val="Lienhypertexte"/>
+          </w:rPr>
+          <w:t>https://github.com/kadiikram/mexora_etl</w:t>
+        </w:r>
+      </w:hyperlink>
+    </w:p>
+    <w:p>
+      <w:pPr>
+        <w:jc w:val="center"/>
+        <w:rPr>
+          <w:color w:val="2C5F8A"/>
+          <w:lang w:val="en-US"/>
+        </w:rPr>
+      </w:pPr>
+      <w:proofErr w:type="gramStart"/>
+      <w:r>
+        <w:rPr>
+          <w:color w:val="2C5F8A"/>
+          <w:lang w:val="en-US"/>
+        </w:rPr>
+        <w:t>GitHub :</w:t>
+      </w:r>
+      <w:proofErr w:type="gramEnd"/>
+      <w:r>
+        <w:rPr>
+          <w:color w:val="2C5F8A"/>
+          <w:lang w:val="en-US"/>
+        </w:rPr>
+        <w:t xml:space="preserve"> </w:t>
+      </w:r>
+      <w:hyperlink r:id="rId11" w:history="1">
+        <w:r>
+          <w:rPr>
+            <w:rStyle w:val="Lienhypertexte"/>
+            <w:lang w:val="en-US"/>
+          </w:rPr>
+          <w:t>https://github.com/mekkaouiloubna/mexora_etl</w:t>
+        </w:r>
+      </w:hyperlink>
+    </w:p>
+    <w:p>
+      <w:pPr>
+        <w:jc w:val="center"/>
+        <w:rPr>
+          <w:color w:val="2C5F8A"/>
+          <w:lang w:val="en-US"/>
+        </w:rPr>
+      </w:pPr>
+    </w:p>
+    <w:p>
+      <w:pPr>
+        <w:spacing w:before="80" w:after="80"/>
+        <w:jc w:val="both"/>
+        <w:rPr>
+          <w:lang w:val="en-US"/>
+        </w:rPr>
+      </w:pPr>
+      <w:bookmarkStart w:id="0" w:name="_GoBack"/>
+      <w:bookmarkEnd w:id="0"/>
+    </w:p>
+    <w:p>
+      <w:pPr>
+        <w:rPr>
+          <w:lang w:val="en-US"/>
+        </w:rPr>
+      </w:pPr>
+      <w:r>
+        <w:rPr>
+          <w:lang w:val="en-US"/>
+        </w:rPr>
         <w:br w:type="page"/>
       </w:r>
     </w:p>
@@ -4118,7 +4210,7 @@
                     </pic:cNvPicPr>
                   </pic:nvPicPr>
                   <pic:blipFill>
-                    <a:blip r:embed="rId9"/>
+                    <a:blip r:embed="rId12"/>
                     <a:srcRect/>
                     <a:stretch>
                       <a:fillRect/>
@@ -10339,7 +10431,7 @@
                     </pic:cNvPicPr>
                   </pic:nvPicPr>
                   <pic:blipFill>
-                    <a:blip r:embed="rId10"/>
+                    <a:blip r:embed="rId13"/>
                     <a:srcRect/>
                     <a:stretch>
                       <a:fillRect/>
@@ -11564,7 +11656,7 @@
                     </pic:cNvPicPr>
                   </pic:nvPicPr>
                   <pic:blipFill>
-                    <a:blip r:embed="rId11"/>
+                    <a:blip r:embed="rId14"/>
                     <a:srcRect/>
                     <a:stretch>
                       <a:fillRect/>
@@ -11766,7 +11858,7 @@
                     </pic:cNvPicPr>
                   </pic:nvPicPr>
                   <pic:blipFill>
-                    <a:blip r:embed="rId12"/>
+                    <a:blip r:embed="rId15"/>
                     <a:srcRect/>
                     <a:stretch>
                       <a:fillRect/>
@@ -11917,7 +12009,7 @@
                     </pic:cNvPicPr>
                   </pic:nvPicPr>
                   <pic:blipFill>
-                    <a:blip r:embed="rId13"/>
+                    <a:blip r:embed="rId16"/>
                     <a:srcRect/>
                     <a:stretch>
                       <a:fillRect/>
@@ -12116,7 +12208,7 @@
                     </pic:cNvPicPr>
                   </pic:nvPicPr>
                   <pic:blipFill>
-                    <a:blip r:embed="rId14"/>
+                    <a:blip r:embed="rId17"/>
                     <a:srcRect/>
                     <a:stretch>
                       <a:fillRect/>
@@ -12280,7 +12372,7 @@
                     </pic:cNvPicPr>
                   </pic:nvPicPr>
                   <pic:blipFill>
-                    <a:blip r:embed="rId15"/>
+                    <a:blip r:embed="rId18"/>
                     <a:srcRect/>
                     <a:stretch>
                       <a:fillRect/>
@@ -13640,6 +13732,18 @@
       <w:szCs w:val="24"/>
     </w:rPr>
   </w:style>
+  <w:style w:type="character" w:styleId="Mentionnonrsolue">
+    <w:name w:val="Unresolved Mention"/>
+    <w:basedOn w:val="Policepardfaut"/>
+    <w:uiPriority w:val="99"/>
+    <w:semiHidden/>
+    <w:unhideWhenUsed/>
+    <w:rsid w:val="00FE0CB9"/>
+    <w:rPr>
+      <w:color w:val="605E5C"/>
+      <w:shd w:val="clear" w:color="auto" w:fill="E1DFDD"/>
+    </w:rPr>
+  </w:style>
 </w:styles>
 </file>
 

</xml_diff>